<commit_message>
Unify UG/PG portal features with strict tier-scoped data isolation.
Director and staff APIs filter by active program tier; UI reloads on portal switch. Adds publication approval flow, finance handoff, budget auto-allocation locks, ethics PG defaults, and workflow fixes across both undergraduate and postgraduate portals.

Co-authored-by: Cursor <cursoragent@cursor.com>
</commit_message>
<xml_diff>
--- a/docs/FULL_SYSTEM_GUIDE_SOM_EN.docx
+++ b/docs/FULL_SYSTEM_GUIDE_SOM_EN.docx
@@ -357,7 +357,7 @@
           <w:sz w:val="22"/>
           <w:szCs w:val="22"/>
         </w:rPr>
-        <w:t xml:space="preserve">Portal switch; funding calls; final proposal approve; ethics decide; PO after Procurement; Users/Departments; analytics</w:t>
+        <w:t xml:space="preserve">Portal switch; create/publish funding calls (no Leadership); final proposal approve; ethics; PO after Procurement; Users; analytics</w:t>
       </w:r>
     </w:p>
     <w:p>
@@ -378,7 +378,7 @@
           <w:sz w:val="22"/>
           <w:szCs w:val="22"/>
         </w:rPr>
-        <w:t xml:space="preserve">Portal; funding calls; ansixinta ugu dambeysa; ethics; PO ka dib Procurement; Users; analytics</w:t>
+        <w:t xml:space="preserve">Portal; abuuri/daabaca funding calls (Leadership uma baahna); ansixinta ugu dambeysa; ethics; PO; Users; analytics</w:t>
       </w:r>
     </w:p>
     <w:p>
@@ -411,7 +411,7 @@
           <w:sz w:val="22"/>
           <w:szCs w:val="22"/>
         </w:rPr>
-        <w:t xml:space="preserve">Publish funding calls; peer review score 1–5 + comment; KPI</w:t>
+        <w:t xml:space="preserve">Peer review score 1–5 + comment; KPI — does NOT publish funding calls</w:t>
       </w:r>
     </w:p>
     <w:p>
@@ -432,7 +432,7 @@
           <w:sz w:val="22"/>
           <w:szCs w:val="22"/>
         </w:rPr>
-        <w:t xml:space="preserve">Daabaca funding calls; peer review; KPI</w:t>
+        <w:t xml:space="preserve">Peer review; KPI — MA daabaco funding calls</w:t>
       </w:r>
     </w:p>
     <w:p>

</xml_diff>

<commit_message>
Improve thesis coordinator review, peer-review UX, and docs accuracy.
Hide director peer-score re-entry after Leadership submits; make thesis title Accept/Reject clear for coordinators; notify Director and Coordinator on supervisor thesis updates; stop auto-seeding demo research and add selective seed-demo cleanup.

Co-authored-by: Cursor <cursoragent@cursor.com>
</commit_message>
<xml_diff>
--- a/docs/FULL_SYSTEM_GUIDE_SOM_EN.docx
+++ b/docs/FULL_SYSTEM_GUIDE_SOM_EN.docx
@@ -357,7 +357,7 @@
           <w:sz w:val="22"/>
           <w:szCs w:val="22"/>
         </w:rPr>
-        <w:t xml:space="preserve">Portal switch; create/publish funding calls (no Leadership); final proposal approve; ethics; PO after Procurement; Users; analytics</w:t>
+        <w:t xml:space="preserve">Portal switch; create/publish funding calls (no Leadership); final proposal approve; ethics; PO after Finance review; Users; analytics</w:t>
       </w:r>
     </w:p>
     <w:p>
@@ -498,7 +498,7 @@
           <w:sz w:val="22"/>
           <w:szCs w:val="22"/>
         </w:rPr>
-        <w:t xml:space="preserve">Finance Officer — MONEY (not Procurement)</w:t>
+        <w:t xml:space="preserve">Finance Officer — MONEY + PO REVIEW</w:t>
       </w:r>
     </w:p>
     <w:p>
@@ -519,7 +519,7 @@
           <w:sz w:val="22"/>
           <w:szCs w:val="22"/>
         </w:rPr>
-        <w:t xml:space="preserve">Authorize grant budget; pay budgets/payments; pay PO after Director; finance reports; finance closure</w:t>
+        <w:t xml:space="preserve">Authorize grant budget; review PO before Director; pay budgets/payments; pay PO after Director; finance reports; finance closure</w:t>
       </w:r>
     </w:p>
     <w:p>
@@ -540,7 +540,7 @@
           <w:sz w:val="22"/>
           <w:szCs w:val="22"/>
         </w:rPr>
-        <w:t xml:space="preserve">Authorize budget; bixi lacag; bixi PO ka dib Director; reports; xiritaan maaliyadeed</w:t>
+        <w:t xml:space="preserve">Authorize budget; dib u eegis PO ka hor Director; bixi lacag; bixi PO ka dib Director; reports; xiritaan</w:t>
       </w:r>
     </w:p>
     <w:p>
@@ -561,7 +561,7 @@
           <w:sz w:val="22"/>
           <w:szCs w:val="22"/>
         </w:rPr>
-        <w:t xml:space="preserve">Does NOT review what to buy</w:t>
+        <w:t xml:space="preserve">Flow: Researcher PO → Finance review → Director → Finance pays</w:t>
       </w:r>
     </w:p>
     <w:p>
@@ -582,7 +582,7 @@
           <w:sz w:val="22"/>
           <w:szCs w:val="22"/>
         </w:rPr>
-        <w:t xml:space="preserve">MA sameeyo dib u eegista iibsashada (Procurement)</w:t>
+        <w:t xml:space="preserve">Safka: Researcher PO → Finance review → Director → Finance bixisaa</w:t>
       </w:r>
     </w:p>
     <w:p>
@@ -594,7 +594,7 @@
           <w:sz w:val="22"/>
           <w:szCs w:val="22"/>
         </w:rPr>
-        <w:t xml:space="preserve">Procurement Officer — BUYING / PO (not Finance)</w:t>
+        <w:t xml:space="preserve">HR Officer</w:t>
       </w:r>
     </w:p>
     <w:p>
@@ -615,7 +615,7 @@
           <w:sz w:val="22"/>
           <w:szCs w:val="22"/>
         </w:rPr>
-        <w:t xml:space="preserve">Review/approve Purchase Orders before Director; does not authorize grants or pay</w:t>
+        <w:t xml:space="preserve">Projects, thesis, groups — HR view only (no money/ethics approvals)</w:t>
       </w:r>
     </w:p>
     <w:p>
@@ -636,7 +636,19 @@
           <w:sz w:val="22"/>
           <w:szCs w:val="22"/>
         </w:rPr>
-        <w:t xml:space="preserve">Dib u eegis PO ka hor Director; ma authorize grant; ma bixin lacag</w:t>
+        <w:t xml:space="preserve">Projects, thesis, groups — HR (ma ansixiyo lacag/ethics)</w:t>
+      </w:r>
+    </w:p>
+    <w:p>
+      <w:pPr>
+        <w:spacing w:after="100"/>
+      </w:pPr>
+      <w:r>
+        <w:rPr>
+          <w:sz w:val="22"/>
+          <w:szCs w:val="22"/>
+        </w:rPr>
+        <w:t xml:space="preserve">Donor Agency</w:t>
       </w:r>
     </w:p>
     <w:p>
@@ -657,7 +669,7 @@
           <w:sz w:val="22"/>
           <w:szCs w:val="22"/>
         </w:rPr>
-        <w:t xml:space="preserve">Flow: Researcher PO → Procurement → Director → Finance pays</w:t>
+        <w:t xml:space="preserve">Draft external funding calls; donor reports</w:t>
       </w:r>
     </w:p>
     <w:p>
@@ -678,7 +690,7 @@
           <w:sz w:val="22"/>
           <w:szCs w:val="22"/>
         </w:rPr>
-        <w:t xml:space="preserve">Safka: Researcher PO → Procurement → Director → Finance bixisaa</w:t>
+        <w:t xml:space="preserve">Funding calls dibadda (draft); donor reports</w:t>
       </w:r>
     </w:p>
     <w:p>
@@ -690,7 +702,7 @@
           <w:sz w:val="22"/>
           <w:szCs w:val="22"/>
         </w:rPr>
-        <w:t xml:space="preserve">HR Officer</w:t>
+        <w:t xml:space="preserve">Researcher</w:t>
       </w:r>
     </w:p>
     <w:p>
@@ -711,7 +723,7 @@
           <w:sz w:val="22"/>
           <w:szCs w:val="22"/>
         </w:rPr>
-        <w:t xml:space="preserve">Projects, thesis, groups — HR view only (no money/ethics approvals)</w:t>
+        <w:t xml:space="preserve">Apply, propose, run project, budgets, create PO, publications, thesis, closure</w:t>
       </w:r>
     </w:p>
     <w:p>
@@ -732,7 +744,252 @@
           <w:sz w:val="22"/>
           <w:szCs w:val="22"/>
         </w:rPr>
-        <w:t xml:space="preserve">Projects, thesis, groups — HR (ma ansixiyo lacag/ethics)</w:t>
+        <w:t xml:space="preserve">Codso, proposal, project, budgets, abuuri PO, publications, thesis, closure</w:t>
+      </w:r>
+    </w:p>
+    <w:p>
+      <w:pPr>
+        <w:spacing w:after="0" w:before="0" w:line="276"/>
+      </w:pPr>
+      <w:r>
+        <w:t xml:space="preserve"/>
+      </w:r>
+    </w:p>
+    <w:p>
+      <w:pPr>
+        <w:spacing w:after="0" w:before="0" w:line="276"/>
+      </w:pPr>
+      <w:r>
+        <w:t xml:space="preserve"/>
+      </w:r>
+    </w:p>
+    <w:p>
+      <w:pPr>
+        <w:spacing w:after="160" w:before="200"/>
+      </w:pPr>
+      <w:r>
+        <w:rPr>
+          <w:b/>
+          <w:bCs/>
+          <w:color w:val="0C4A6E"/>
+          <w:sz w:val="36"/>
+          <w:szCs w:val="36"/>
+        </w:rPr>
+        <w:t xml:space="preserve">3. LOGIN &amp; PORTAL / GALITAANKA</w:t>
+      </w:r>
+    </w:p>
+    <w:p>
+      <w:pPr>
+        <w:spacing w:after="80"/>
+      </w:pPr>
+      <w:r>
+        <w:rPr>
+          <w:b/>
+          <w:bCs/>
+          <w:sz w:val="22"/>
+          <w:szCs w:val="22"/>
+        </w:rPr>
+        <w:t xml:space="preserve">English steps:</w:t>
+      </w:r>
+    </w:p>
+    <w:p>
+      <w:pPr>
+        <w:spacing w:after="0" w:before="0" w:line="276"/>
+      </w:pPr>
+      <w:r>
+        <w:t xml:space="preserve"/>
+      </w:r>
+    </w:p>
+    <w:p>
+      <w:pPr>
+        <w:spacing w:after="0" w:before="0" w:line="276"/>
+      </w:pPr>
+      <w:r>
+        <w:t xml:space="preserve"/>
+      </w:r>
+    </w:p>
+    <w:p>
+      <w:pPr>
+        <w:spacing w:after="160" w:before="200"/>
+      </w:pPr>
+      <w:r>
+        <w:rPr>
+          <w:b/>
+          <w:bCs/>
+          <w:color w:val="0C4A6E"/>
+          <w:sz w:val="36"/>
+          <w:szCs w:val="36"/>
+        </w:rPr>
+        <w:t xml:space="preserve">1. Open http://localhost:5173 → email + password</w:t>
+      </w:r>
+    </w:p>
+    <w:p>
+      <w:pPr>
+        <w:spacing w:after="0" w:before="0" w:line="276"/>
+      </w:pPr>
+      <w:r>
+        <w:t xml:space="preserve"/>
+      </w:r>
+    </w:p>
+    <w:p>
+      <w:pPr>
+        <w:spacing w:after="0" w:before="0" w:line="276"/>
+      </w:pPr>
+      <w:r>
+        <w:t xml:space="preserve"/>
+      </w:r>
+    </w:p>
+    <w:p>
+      <w:pPr>
+        <w:spacing w:after="160" w:before="200"/>
+      </w:pPr>
+      <w:r>
+        <w:rPr>
+          <w:b/>
+          <w:bCs/>
+          <w:color w:val="0C4A6E"/>
+          <w:sz w:val="36"/>
+          <w:szCs w:val="36"/>
+        </w:rPr>
+        <w:t xml:space="preserve">2. If Director → choose Undergraduate or Postgraduate</w:t>
+      </w:r>
+    </w:p>
+    <w:p>
+      <w:pPr>
+        <w:spacing w:after="0" w:before="0" w:line="276"/>
+      </w:pPr>
+      <w:r>
+        <w:t xml:space="preserve"/>
+      </w:r>
+    </w:p>
+    <w:p>
+      <w:pPr>
+        <w:spacing w:after="0" w:before="0" w:line="276"/>
+      </w:pPr>
+      <w:r>
+        <w:t xml:space="preserve"/>
+      </w:r>
+    </w:p>
+    <w:p>
+      <w:pPr>
+        <w:spacing w:after="160" w:before="200"/>
+      </w:pPr>
+      <w:r>
+        <w:rPr>
+          <w:b/>
+          <w:bCs/>
+          <w:color w:val="0C4A6E"/>
+          <w:sz w:val="36"/>
+          <w:szCs w:val="36"/>
+        </w:rPr>
+        <w:t xml:space="preserve">3. Everyone else → one portal only (UG or PG)</w:t>
+      </w:r>
+    </w:p>
+    <w:p>
+      <w:pPr>
+        <w:spacing w:after="80"/>
+      </w:pPr>
+      <w:r>
+        <w:rPr>
+          <w:b/>
+          <w:bCs/>
+          <w:sz w:val="22"/>
+          <w:szCs w:val="22"/>
+        </w:rPr>
+        <w:t xml:space="preserve">Somali steps:</w:t>
+      </w:r>
+    </w:p>
+    <w:p>
+      <w:pPr>
+        <w:spacing w:after="0" w:before="0" w:line="276"/>
+      </w:pPr>
+      <w:r>
+        <w:t xml:space="preserve"/>
+      </w:r>
+    </w:p>
+    <w:p>
+      <w:pPr>
+        <w:spacing w:after="0" w:before="0" w:line="276"/>
+      </w:pPr>
+      <w:r>
+        <w:t xml:space="preserve"/>
+      </w:r>
+    </w:p>
+    <w:p>
+      <w:pPr>
+        <w:spacing w:after="160" w:before="200"/>
+      </w:pPr>
+      <w:r>
+        <w:rPr>
+          <w:b/>
+          <w:bCs/>
+          <w:color w:val="0C4A6E"/>
+          <w:sz w:val="36"/>
+          <w:szCs w:val="36"/>
+        </w:rPr>
+        <w:t xml:space="preserve">1. Fur http://localhost:5173 → email + password</w:t>
+      </w:r>
+    </w:p>
+    <w:p>
+      <w:pPr>
+        <w:spacing w:after="0" w:before="0" w:line="276"/>
+      </w:pPr>
+      <w:r>
+        <w:t xml:space="preserve"/>
+      </w:r>
+    </w:p>
+    <w:p>
+      <w:pPr>
+        <w:spacing w:after="0" w:before="0" w:line="276"/>
+      </w:pPr>
+      <w:r>
+        <w:t xml:space="preserve"/>
+      </w:r>
+    </w:p>
+    <w:p>
+      <w:pPr>
+        <w:spacing w:after="160" w:before="200"/>
+      </w:pPr>
+      <w:r>
+        <w:rPr>
+          <w:b/>
+          <w:bCs/>
+          <w:color w:val="0C4A6E"/>
+          <w:sz w:val="36"/>
+          <w:szCs w:val="36"/>
+        </w:rPr>
+        <w:t xml:space="preserve">2. Haddii Director → dooro Undergraduate ama Postgraduate</w:t>
+      </w:r>
+    </w:p>
+    <w:p>
+      <w:pPr>
+        <w:spacing w:after="0" w:before="0" w:line="276"/>
+      </w:pPr>
+      <w:r>
+        <w:t xml:space="preserve"/>
+      </w:r>
+    </w:p>
+    <w:p>
+      <w:pPr>
+        <w:spacing w:after="0" w:before="0" w:line="276"/>
+      </w:pPr>
+      <w:r>
+        <w:t xml:space="preserve"/>
+      </w:r>
+    </w:p>
+    <w:p>
+      <w:pPr>
+        <w:spacing w:after="160" w:before="200"/>
+      </w:pPr>
+      <w:r>
+        <w:rPr>
+          <w:b/>
+          <w:bCs/>
+          <w:color w:val="0C4A6E"/>
+          <w:sz w:val="36"/>
+          <w:szCs w:val="36"/>
+        </w:rPr>
+        <w:t xml:space="preserve">3. Dadka kale → hal portal kaliya</w:t>
       </w:r>
     </w:p>
     <w:p>
@@ -744,360 +1001,7 @@
           <w:sz w:val="22"/>
           <w:szCs w:val="22"/>
         </w:rPr>
-        <w:t xml:space="preserve">Donor Agency</w:t>
-      </w:r>
-    </w:p>
-    <w:p>
-      <w:pPr>
-        <w:spacing w:after="80"/>
-      </w:pPr>
-      <w:r>
-        <w:rPr>
-          <w:b/>
-          <w:bCs/>
-          <w:sz w:val="22"/>
-          <w:szCs w:val="22"/>
-        </w:rPr>
-        <w:t xml:space="preserve">EN: </w:t>
-      </w:r>
-      <w:r>
-        <w:rPr>
-          <w:sz w:val="22"/>
-          <w:szCs w:val="22"/>
-        </w:rPr>
-        <w:t xml:space="preserve">Draft external funding calls; donor reports</w:t>
-      </w:r>
-    </w:p>
-    <w:p>
-      <w:pPr>
-        <w:spacing w:after="80"/>
-      </w:pPr>
-      <w:r>
-        <w:rPr>
-          <w:b/>
-          <w:bCs/>
-          <w:sz w:val="22"/>
-          <w:szCs w:val="22"/>
-        </w:rPr>
-        <w:t xml:space="preserve">SO: </w:t>
-      </w:r>
-      <w:r>
-        <w:rPr>
-          <w:sz w:val="22"/>
-          <w:szCs w:val="22"/>
-        </w:rPr>
-        <w:t xml:space="preserve">Funding calls dibadda (draft); donor reports</w:t>
-      </w:r>
-    </w:p>
-    <w:p>
-      <w:pPr>
-        <w:spacing w:after="100"/>
-      </w:pPr>
-      <w:r>
-        <w:rPr>
-          <w:sz w:val="22"/>
-          <w:szCs w:val="22"/>
-        </w:rPr>
-        <w:t xml:space="preserve">Researcher</w:t>
-      </w:r>
-    </w:p>
-    <w:p>
-      <w:pPr>
-        <w:spacing w:after="80"/>
-      </w:pPr>
-      <w:r>
-        <w:rPr>
-          <w:b/>
-          <w:bCs/>
-          <w:sz w:val="22"/>
-          <w:szCs w:val="22"/>
-        </w:rPr>
-        <w:t xml:space="preserve">EN: </w:t>
-      </w:r>
-      <w:r>
-        <w:rPr>
-          <w:sz w:val="22"/>
-          <w:szCs w:val="22"/>
-        </w:rPr>
-        <w:t xml:space="preserve">Apply, propose, run project, budgets, create PO, publications, thesis, closure</w:t>
-      </w:r>
-    </w:p>
-    <w:p>
-      <w:pPr>
-        <w:spacing w:after="80"/>
-      </w:pPr>
-      <w:r>
-        <w:rPr>
-          <w:b/>
-          <w:bCs/>
-          <w:sz w:val="22"/>
-          <w:szCs w:val="22"/>
-        </w:rPr>
-        <w:t xml:space="preserve">SO: </w:t>
-      </w:r>
-      <w:r>
-        <w:rPr>
-          <w:sz w:val="22"/>
-          <w:szCs w:val="22"/>
-        </w:rPr>
-        <w:t xml:space="preserve">Codso, proposal, project, budgets, abuuri PO, publications, thesis, closure</w:t>
-      </w:r>
-    </w:p>
-    <w:p>
-      <w:pPr>
-        <w:spacing w:after="0" w:before="0" w:line="276"/>
-      </w:pPr>
-      <w:r>
-        <w:t xml:space="preserve"/>
-      </w:r>
-    </w:p>
-    <w:p>
-      <w:pPr>
-        <w:spacing w:after="0" w:before="0" w:line="276"/>
-      </w:pPr>
-      <w:r>
-        <w:t xml:space="preserve"/>
-      </w:r>
-    </w:p>
-    <w:p>
-      <w:pPr>
-        <w:spacing w:after="160" w:before="200"/>
-      </w:pPr>
-      <w:r>
-        <w:rPr>
-          <w:b/>
-          <w:bCs/>
-          <w:color w:val="0C4A6E"/>
-          <w:sz w:val="36"/>
-          <w:szCs w:val="36"/>
-        </w:rPr>
-        <w:t xml:space="preserve">3. LOGIN &amp; PORTAL / GALITAANKA</w:t>
-      </w:r>
-    </w:p>
-    <w:p>
-      <w:pPr>
-        <w:spacing w:after="80"/>
-      </w:pPr>
-      <w:r>
-        <w:rPr>
-          <w:b/>
-          <w:bCs/>
-          <w:sz w:val="22"/>
-          <w:szCs w:val="22"/>
-        </w:rPr>
-        <w:t xml:space="preserve">English steps:</w:t>
-      </w:r>
-    </w:p>
-    <w:p>
-      <w:pPr>
-        <w:spacing w:after="0" w:before="0" w:line="276"/>
-      </w:pPr>
-      <w:r>
-        <w:t xml:space="preserve"/>
-      </w:r>
-    </w:p>
-    <w:p>
-      <w:pPr>
-        <w:spacing w:after="0" w:before="0" w:line="276"/>
-      </w:pPr>
-      <w:r>
-        <w:t xml:space="preserve"/>
-      </w:r>
-    </w:p>
-    <w:p>
-      <w:pPr>
-        <w:spacing w:after="160" w:before="200"/>
-      </w:pPr>
-      <w:r>
-        <w:rPr>
-          <w:b/>
-          <w:bCs/>
-          <w:color w:val="0C4A6E"/>
-          <w:sz w:val="36"/>
-          <w:szCs w:val="36"/>
-        </w:rPr>
-        <w:t xml:space="preserve">1. Open http://localhost:5173 → email + password</w:t>
-      </w:r>
-    </w:p>
-    <w:p>
-      <w:pPr>
-        <w:spacing w:after="0" w:before="0" w:line="276"/>
-      </w:pPr>
-      <w:r>
-        <w:t xml:space="preserve"/>
-      </w:r>
-    </w:p>
-    <w:p>
-      <w:pPr>
-        <w:spacing w:after="0" w:before="0" w:line="276"/>
-      </w:pPr>
-      <w:r>
-        <w:t xml:space="preserve"/>
-      </w:r>
-    </w:p>
-    <w:p>
-      <w:pPr>
-        <w:spacing w:after="160" w:before="200"/>
-      </w:pPr>
-      <w:r>
-        <w:rPr>
-          <w:b/>
-          <w:bCs/>
-          <w:color w:val="0C4A6E"/>
-          <w:sz w:val="36"/>
-          <w:szCs w:val="36"/>
-        </w:rPr>
-        <w:t xml:space="preserve">2. If Director → choose Undergraduate or Postgraduate</w:t>
-      </w:r>
-    </w:p>
-    <w:p>
-      <w:pPr>
-        <w:spacing w:after="0" w:before="0" w:line="276"/>
-      </w:pPr>
-      <w:r>
-        <w:t xml:space="preserve"/>
-      </w:r>
-    </w:p>
-    <w:p>
-      <w:pPr>
-        <w:spacing w:after="0" w:before="0" w:line="276"/>
-      </w:pPr>
-      <w:r>
-        <w:t xml:space="preserve"/>
-      </w:r>
-    </w:p>
-    <w:p>
-      <w:pPr>
-        <w:spacing w:after="160" w:before="200"/>
-      </w:pPr>
-      <w:r>
-        <w:rPr>
-          <w:b/>
-          <w:bCs/>
-          <w:color w:val="0C4A6E"/>
-          <w:sz w:val="36"/>
-          <w:szCs w:val="36"/>
-        </w:rPr>
-        <w:t xml:space="preserve">3. Everyone else → one portal only (UG or PG)</w:t>
-      </w:r>
-    </w:p>
-    <w:p>
-      <w:pPr>
-        <w:spacing w:after="80"/>
-      </w:pPr>
-      <w:r>
-        <w:rPr>
-          <w:b/>
-          <w:bCs/>
-          <w:sz w:val="22"/>
-          <w:szCs w:val="22"/>
-        </w:rPr>
-        <w:t xml:space="preserve">Somali steps:</w:t>
-      </w:r>
-    </w:p>
-    <w:p>
-      <w:pPr>
-        <w:spacing w:after="0" w:before="0" w:line="276"/>
-      </w:pPr>
-      <w:r>
-        <w:t xml:space="preserve"/>
-      </w:r>
-    </w:p>
-    <w:p>
-      <w:pPr>
-        <w:spacing w:after="0" w:before="0" w:line="276"/>
-      </w:pPr>
-      <w:r>
-        <w:t xml:space="preserve"/>
-      </w:r>
-    </w:p>
-    <w:p>
-      <w:pPr>
-        <w:spacing w:after="160" w:before="200"/>
-      </w:pPr>
-      <w:r>
-        <w:rPr>
-          <w:b/>
-          <w:bCs/>
-          <w:color w:val="0C4A6E"/>
-          <w:sz w:val="36"/>
-          <w:szCs w:val="36"/>
-        </w:rPr>
-        <w:t xml:space="preserve">1. Fur http://localhost:5173 → email + password</w:t>
-      </w:r>
-    </w:p>
-    <w:p>
-      <w:pPr>
-        <w:spacing w:after="0" w:before="0" w:line="276"/>
-      </w:pPr>
-      <w:r>
-        <w:t xml:space="preserve"/>
-      </w:r>
-    </w:p>
-    <w:p>
-      <w:pPr>
-        <w:spacing w:after="0" w:before="0" w:line="276"/>
-      </w:pPr>
-      <w:r>
-        <w:t xml:space="preserve"/>
-      </w:r>
-    </w:p>
-    <w:p>
-      <w:pPr>
-        <w:spacing w:after="160" w:before="200"/>
-      </w:pPr>
-      <w:r>
-        <w:rPr>
-          <w:b/>
-          <w:bCs/>
-          <w:color w:val="0C4A6E"/>
-          <w:sz w:val="36"/>
-          <w:szCs w:val="36"/>
-        </w:rPr>
-        <w:t xml:space="preserve">2. Haddii Director → dooro Undergraduate ama Postgraduate</w:t>
-      </w:r>
-    </w:p>
-    <w:p>
-      <w:pPr>
-        <w:spacing w:after="0" w:before="0" w:line="276"/>
-      </w:pPr>
-      <w:r>
-        <w:t xml:space="preserve"/>
-      </w:r>
-    </w:p>
-    <w:p>
-      <w:pPr>
-        <w:spacing w:after="0" w:before="0" w:line="276"/>
-      </w:pPr>
-      <w:r>
-        <w:t xml:space="preserve"/>
-      </w:r>
-    </w:p>
-    <w:p>
-      <w:pPr>
-        <w:spacing w:after="160" w:before="200"/>
-      </w:pPr>
-      <w:r>
-        <w:rPr>
-          <w:b/>
-          <w:bCs/>
-          <w:color w:val="0C4A6E"/>
-          <w:sz w:val="36"/>
-          <w:szCs w:val="36"/>
-        </w:rPr>
-        <w:t xml:space="preserve">3. Dadka kale → hal portal kaliya</w:t>
-      </w:r>
-    </w:p>
-    <w:p>
-      <w:pPr>
-        <w:spacing w:after="100"/>
-      </w:pPr>
-      <w:r>
-        <w:rPr>
-          <w:sz w:val="22"/>
-          <w:szCs w:val="22"/>
-        </w:rPr>
-        <w:t xml:space="preserve">Demo accounts (npm run seed) — 15 accounts:</w:t>
+        <w:t xml:space="preserve">Demo accounts (npm run seed):</w:t>
       </w:r>
     </w:p>
     <w:p>
@@ -1133,7 +1037,7 @@
         <w:ind w:left="360"/>
       </w:pPr>
       <w:r>
-        <w:t xml:space="preserve">procurement@rms.edu         Procurement2024!    Procurement (UG)</w:t>
+        <w:t xml:space="preserve">hr@rms.edu                  Hr2024!             HR (UG)</w:t>
       </w:r>
     </w:p>
     <w:p>
@@ -1142,7 +1046,7 @@
         <w:ind w:left="360"/>
       </w:pPr>
       <w:r>
-        <w:t xml:space="preserve">hr@rms.edu                  Hr2024!             HR (UG)</w:t>
+        <w:t xml:space="preserve">leadership@rms.edu          Leadership2024!     Leadership (UG)</w:t>
       </w:r>
     </w:p>
     <w:p>
@@ -1151,7 +1055,7 @@
         <w:ind w:left="360"/>
       </w:pPr>
       <w:r>
-        <w:t xml:space="preserve">leadership@rms.edu          Leadership2024!     Leadership (UG)</w:t>
+        <w:t xml:space="preserve">donor@rms.edu               Donor2024!          Donor (UG)</w:t>
       </w:r>
     </w:p>
     <w:p>
@@ -1160,7 +1064,7 @@
         <w:ind w:left="360"/>
       </w:pPr>
       <w:r>
-        <w:t xml:space="preserve">donor@rms.edu               Donor2024!          Donor (UG)</w:t>
+        <w:t xml:space="preserve">asha@rms.edu                Researcher2024!     Researcher UG</w:t>
       </w:r>
     </w:p>
     <w:p>
@@ -1169,7 +1073,7 @@
         <w:ind w:left="360"/>
       </w:pPr>
       <w:r>
-        <w:t xml:space="preserve">asha@rms.edu                Researcher2024!     Researcher UG</w:t>
+        <w:t xml:space="preserve">coordinator.pg@rms.edu      Coordinator2024!    Coordinator (PG)</w:t>
       </w:r>
     </w:p>
     <w:p>
@@ -1178,7 +1082,7 @@
         <w:ind w:left="360"/>
       </w:pPr>
       <w:r>
-        <w:t xml:space="preserve">coordinator.pg@rms.edu      Coordinator2024!    Coordinator (PG)</w:t>
+        <w:t xml:space="preserve">finance.pg@rms.edu          Finance2024!        Finance (PG)</w:t>
       </w:r>
     </w:p>
     <w:p>
@@ -1187,7 +1091,7 @@
         <w:ind w:left="360"/>
       </w:pPr>
       <w:r>
-        <w:t xml:space="preserve">finance.pg@rms.edu          Finance2024!        Finance (PG)</w:t>
+        <w:t xml:space="preserve">hr.pg@rms.edu               Hr2024!             HR (PG)</w:t>
       </w:r>
     </w:p>
     <w:p>
@@ -1196,7 +1100,7 @@
         <w:ind w:left="360"/>
       </w:pPr>
       <w:r>
-        <w:t xml:space="preserve">procurement.pg@rms.edu      Procurement2024!    Procurement (PG)</w:t>
+        <w:t xml:space="preserve">leadership.pg@rms.edu       Leadership2024!     Leadership (PG)</w:t>
       </w:r>
     </w:p>
     <w:p>
@@ -1205,7 +1109,7 @@
         <w:ind w:left="360"/>
       </w:pPr>
       <w:r>
-        <w:t xml:space="preserve">hr.pg@rms.edu               Hr2024!             HR (PG)</w:t>
+        <w:t xml:space="preserve">donor.pg@rms.edu            Donor2024!          Donor (PG)</w:t>
       </w:r>
     </w:p>
     <w:p>
@@ -1214,24 +1118,6 @@
         <w:ind w:left="360"/>
       </w:pPr>
       <w:r>
-        <w:t xml:space="preserve">leadership.pg@rms.edu       Leadership2024!     Leadership (PG)</w:t>
-      </w:r>
-    </w:p>
-    <w:p>
-      <w:pPr>
-        <w:spacing w:after="60"/>
-        <w:ind w:left="360"/>
-      </w:pPr>
-      <w:r>
-        <w:t xml:space="preserve">donor.pg@rms.edu            Donor2024!          Donor (PG)</w:t>
-      </w:r>
-    </w:p>
-    <w:p>
-      <w:pPr>
-        <w:spacing w:after="60"/>
-        <w:ind w:left="360"/>
-      </w:pPr>
-      <w:r>
         <w:t xml:space="preserve">mahad@rms.edu               Researcher2024!     Researcher PG</w:t>
       </w:r>
     </w:p>
@@ -1244,7 +1130,7 @@
           <w:sz w:val="22"/>
           <w:szCs w:val="22"/>
         </w:rPr>
-        <w:t xml:space="preserve">Removed: ethics@rms.edu, reviewer@rms.edu</w:t>
+        <w:t xml:space="preserve">Removed: ethics@rms.edu, reviewer@rms.edu, procurement@rms.edu, procurement.pg@rms.edu</w:t>
       </w:r>
     </w:p>
     <w:p>
@@ -2041,7 +1927,7 @@
           <w:sz w:val="30"/>
           <w:szCs w:val="30"/>
         </w:rPr>
-        <w:t xml:space="preserve">STEP 5 — Finance &amp; Procurement / Maaliyad &amp; Iibsashada</w:t>
+        <w:t xml:space="preserve">STEP 5 — Finance &amp; Purchase Orders / Maaliyad &amp; PO</w:t>
       </w:r>
     </w:p>
     <w:p>
@@ -2148,7 +2034,7 @@
           <w:sz w:val="36"/>
           <w:szCs w:val="36"/>
         </w:rPr>
-        <w:t xml:space="preserve">3. Purchase orders: Researcher → Procurement → Director → Finance pays</w:t>
+        <w:t xml:space="preserve">3. Purchase orders: Researcher → Finance review → Director → Finance pays</w:t>
       </w:r>
     </w:p>
     <w:p>
@@ -2255,7 +2141,7 @@
           <w:sz w:val="36"/>
           <w:szCs w:val="36"/>
         </w:rPr>
-        <w:t xml:space="preserve">3. PO: Researcher → Procurement → Director → Finance</w:t>
+        <w:t xml:space="preserve">3. PO: Researcher → Finance review → Director → Finance</w:t>
       </w:r>
     </w:p>
     <w:p>
@@ -2532,7 +2418,7 @@
           <w:sz w:val="22"/>
           <w:szCs w:val="22"/>
         </w:rPr>
-        <w:t xml:space="preserve">Dashboard &amp; Analytics — Everyone Projects — Director, Coordinator, Researcher, HR Research Workflow Status — Director, Coordinator, Researcher Publications &amp; Outputs — Director, Coordinator, Researcher Ethics — Director, Coordinator, Researcher Proposals — Director, Coordinator, Researcher, Leadership Grant funding approval — Finance only Project closure (Finance) — Finance only Peer Reviews — Director, Leadership Thesis — Director, Coordinator, Researcher, HR Funding Calls — Director, Coordinator, Finance, Researcher, Leadership, Procurement, Donor Policies — Everyone Grants — Director, Coordinator, Finance, Researcher, Leadership, Procurement, Donor Finance &amp; Budgets — Director, Finance, Researcher, Procurement Finance Reports — Director, Finance KPI Dashboard — Director, Coordinator, Leadership Search — Director, Coordinator, Researcher, Leadership, HR Donor Reports — Director, Finance, Donor Audit Trail — Director, Coordinator Repository — Director, Coordinator, Researcher Collaboration — Director, Coordinator, Researcher Groups — Director, Coordinator, Researcher, HR Messages — Director, Coordinator, Researcher, HR Notifications — Everyone Users / Departments — Director only Profile — Everyone</w:t>
+        <w:t xml:space="preserve">Dashboard &amp; Analytics — Everyone Projects — Director, Coordinator, Researcher, HR Research Workflow Status — Director, Coordinator, Researcher Publications &amp; Outputs — Director, Coordinator, Researcher Ethics — Director, Coordinator, Researcher Proposals — Director, Coordinator, Researcher, Leadership Grant funding approval — Finance only Project closure (Finance) — Finance only Peer Reviews — Director, Leadership Thesis — Director, Coordinator, Researcher, HR Funding Calls — Director, Coordinator, Finance, Researcher, Leadership, Donor Policies — Everyone Grants — Director, Coordinator, Finance, Researcher, Leadership, Donor Finance &amp; Budgets — Director, Finance, Researcher Finance Reports — Director, Finance KPI Dashboard — Director, Coordinator, Leadership Search — Director, Coordinator, Researcher, Leadership, HR Donor Reports — Director, Finance, Donor Audit Trail — Director, Coordinator Repository — Director, Coordinator, Researcher Collaboration — Director, Coordinator, Researcher Groups — Director, Coordinator, Researcher, HR Messages — Director, Coordinator, Researcher, HR Notifications — Everyone Users / Departments — Director only Profile — Everyone</w:t>
       </w:r>
     </w:p>
     <w:p>
@@ -2575,7 +2461,7 @@
           <w:sz w:val="22"/>
           <w:szCs w:val="22"/>
         </w:rPr>
-        <w:t xml:space="preserve">Funding Call → Grant Application ↓ Proposal + Ethics + Budget + Docs ↓ Multi-stage Review (Leadership peer review · Director ethics) ↓ Director Approves → Project Created · Grant pending_finance ↓ Finance Authorize budget → Work Plan + Activities + Budget ↓ Payments + Procurement ↓ Publications (Validate = Published) + Repository + Progress ↓ Closure Checklist + Lessons Learned ↓ Director + Finance Approve → Archived / Closed</w:t>
+        <w:t xml:space="preserve">Funding Call → Grant Application ↓ Proposal + Ethics + Budget + Docs ↓ Multi-stage Review (Leadership peer review · Director ethics) ↓ Director Approves → Project Created · Grant pending_finance ↓ Finance Authorize budget → Work Plan + Activities + Budget ↓ Payments + Purchase Orders ↓ Publications (Validate = Published) + Repository + Progress ↓ Closure Checklist + Lessons Learned ↓ Director + Finance Approve → Archived / Closed</w:t>
       </w:r>
     </w:p>
     <w:p>

</xml_diff>